<commit_message>
Enlarge embedded manuscript figures for readability, synchronize Table 5 and accessibility, update tag paper-jon-v1.0
</commit_message>
<xml_diff>
--- a/publication/journal_of_navigation_submission/01_JON_manuscript.docx
+++ b/publication/journal_of_navigation_submission/01_JON_manuscript.docx
@@ -94,7 +94,7 @@
           <w:rFonts w:ascii="Times New Roman" w:hAnsi="Times New Roman"/>
           <w:sz w:val="24"/>
         </w:rPr>
-        <w:t>During Global Navigation Satellite System (GNSS) outages, smartphone inertial dead reckoning suffers from rapid nonlinear open-loop position drift due to low-cost sensor errors. We present an empirical study evaluating learned forward velocity estimation, sensor fusion, kinematic constraints, map feedback, and distribution shifts using the public IO-VNBD benchmark dataset (64 passenger-car trips, 16.27 hours). On 19 trip-disjoint test routes, scaling a causal temporal convolutional network from 6 to 39 training trips reduces velocity error by 55.27% (6.17 to 2.76 m/s) and 60-second drift by 64.72% (263.6 to 93.0 m). However, unconditional lateral kinematic constraints degrade 60-second drift by 45.47%, and closed-loop map heading feedback degrades drift by 125.5%. Across 13 usable 60-second blackout trajectories, adaptive fusion achieves 96.65 m mean absolute drift and a macro-average normalized drift of 16.76% across the 12 dynamic routes (stationary control Vw15 excluded per Eq. 13), satisfying a sub-10% drift benchmark on 3 of 13 routes (23.08%). Physical road validation and multi-driver generalisation remain open challenges.</w:t>
+        <w:t>During Global Navigation Satellite System (GNSS) outages, smartphone inertial dead reckoning suffers from rapid nonlinear open-loop position drift. We present an empirical study evaluating learned forward velocity estimation, sensor fusion, kinematic constraints, map feedback, and distribution shifts using the public IO-VNBD benchmark dataset (64 passenger-car trips, 16.27 hours). On 19 trip-disjoint test routes, scaling a causal temporal convolutional network from 6 to 39 training trips reduces velocity error by 55.27% (6.17 to 2.76 m/s) and 60-second drift by 64.72% (263.6 to 93.0 m). Unconditional lateral kinematic constraints degrade 60-second drift by 45.47%, and closed-loop map heading feedback degrades drift by 125.5%. Across 13 usable 60-second blackout trajectories, adaptive fusion achieves 96.65 m mean absolute drift and 16.76% macro-average normalized drift across 12 dynamic routes (excluding stationary control Vw15), satisfying a sub-10% drift benchmark on 3 of 13 routes (23.08%). Physical road validation and multi-driver generalisation remain open challenges.</w:t>
       </w:r>
     </w:p>
     <w:p>
@@ -6389,14 +6389,13 @@
     </w:p>
     <w:p>
       <w:pPr>
-        <w:keepNext/>
         <w:spacing w:before="0" w:after="0" w:line="240" w:lineRule="auto"/>
         <w:jc w:val="center"/>
       </w:pPr>
       <w:r>
         <w:drawing>
           <wp:inline xmlns:a="http://schemas.openxmlformats.org/drawingml/2006/main" xmlns:pic="http://schemas.openxmlformats.org/drawingml/2006/picture">
-            <wp:extent cx="2057400" cy="1415642"/>
+            <wp:extent cx="5303520" cy="3649211"/>
             <wp:docPr id="1" name="Picture 1"/>
             <wp:cNvGraphicFramePr>
               <a:graphicFrameLocks noChangeAspect="1"/>
@@ -6417,7 +6416,7 @@
                   <pic:spPr>
                     <a:xfrm>
                       <a:off x="0" y="0"/>
-                      <a:ext cx="2057400" cy="1415642"/>
+                      <a:ext cx="5303520" cy="3649211"/>
                     </a:xfrm>
                     <a:prstGeom prst="rect"/>
                   </pic:spPr>
@@ -9323,7 +9322,7 @@
           <w:color w:val="000000"/>
           <w:sz w:val="24"/>
         </w:rPr>
-        <w:t xml:space="preserve"> denotes the set of dynamic driving routes, with the stationary control route (Vw15) excluded from normalized percentage calculation to prevent division-by-zero distortion (</w:t>
+        <w:t xml:space="preserve"> denotes the set of dynamic driving routes, with the stationary control route (Vw15) excluded from normalized percentage calculation to avoid distortion from the near-zero travel-distance denominator (</w:t>
       </w:r>
       <m:oMath>
         <m:r>
@@ -9342,7 +9341,32 @@
           <w:color w:val="000000"/>
           <w:sz w:val="24"/>
         </w:rPr>
-        <w:t xml:space="preserve">). Absolute drift </w:t>
+        <w:t xml:space="preserve">). Normalised drift percentages are calculated using the reference distance travelled during the corresponding 60-s blackout window, </w:t>
+      </w:r>
+      <m:oMath>
+        <m:sSub>
+          <m:e>
+            <m:r>
+              <m:t>S</m:t>
+            </m:r>
+          </m:e>
+          <m:sub>
+            <m:r>
+              <m:t>m</m:t>
+            </m:r>
+          </m:sub>
+        </m:sSub>
+        <m:r>
+          <m:t>(T)</m:t>
+        </m:r>
+      </m:oMath>
+      <w:r>
+        <w:rPr>
+          <w:rFonts w:ascii="Times New Roman" w:hAnsi="Times New Roman"/>
+          <w:color w:val="000000"/>
+          <w:sz w:val="24"/>
+        </w:rPr>
+        <w:t xml:space="preserve">, which can differ from total trip distance. Absolute drift </w:t>
       </w:r>
       <m:oMath>
         <m:sSub>
@@ -13874,14 +13898,13 @@
     </w:p>
     <w:p>
       <w:pPr>
-        <w:keepNext/>
         <w:spacing w:before="0" w:after="0" w:line="240" w:lineRule="auto"/>
         <w:jc w:val="center"/>
       </w:pPr>
       <w:r>
         <w:drawing>
           <wp:inline xmlns:a="http://schemas.openxmlformats.org/drawingml/2006/main" xmlns:pic="http://schemas.openxmlformats.org/drawingml/2006/picture">
-            <wp:extent cx="2057400" cy="942732"/>
+            <wp:extent cx="5029200" cy="2304456"/>
             <wp:docPr id="2" name="Picture 2"/>
             <wp:cNvGraphicFramePr>
               <a:graphicFrameLocks noChangeAspect="1"/>
@@ -13902,7 +13925,7 @@
                   <pic:spPr>
                     <a:xfrm>
                       <a:off x="0" y="0"/>
-                      <a:ext cx="2057400" cy="942732"/>
+                      <a:ext cx="5029200" cy="2304456"/>
                     </a:xfrm>
                     <a:prstGeom prst="rect"/>
                   </pic:spPr>
@@ -14994,14 +15017,13 @@
     </w:p>
     <w:p>
       <w:pPr>
-        <w:keepNext/>
         <w:spacing w:before="0" w:after="0" w:line="240" w:lineRule="auto"/>
         <w:jc w:val="center"/>
       </w:pPr>
       <w:r>
         <w:drawing>
           <wp:inline xmlns:a="http://schemas.openxmlformats.org/drawingml/2006/main" xmlns:pic="http://schemas.openxmlformats.org/drawingml/2006/picture">
-            <wp:extent cx="2057400" cy="1531201"/>
+            <wp:extent cx="5120640" cy="3810990"/>
             <wp:docPr id="3" name="Picture 3"/>
             <wp:cNvGraphicFramePr>
               <a:graphicFrameLocks noChangeAspect="1"/>
@@ -15022,7 +15044,7 @@
                   <pic:spPr>
                     <a:xfrm>
                       <a:off x="0" y="0"/>
-                      <a:ext cx="2057400" cy="1531201"/>
+                      <a:ext cx="5120640" cy="3810990"/>
                     </a:xfrm>
                     <a:prstGeom prst="rect"/>
                   </pic:spPr>
@@ -15362,7 +15384,7 @@
                 <w:color w:val="000000"/>
                 <w:sz w:val="17"/>
               </w:rPr>
-              <w:t>Relative Drift vs. Baseline (%)</w:t>
+              <w:t>Relative Drift to Variant E (%)</w:t>
             </w:r>
           </w:p>
         </w:tc>
@@ -17196,14 +17218,13 @@
     </w:p>
     <w:p>
       <w:pPr>
-        <w:keepNext/>
         <w:spacing w:before="0" w:after="0" w:line="240" w:lineRule="auto"/>
         <w:jc w:val="center"/>
       </w:pPr>
       <w:r>
         <w:drawing>
           <wp:inline xmlns:a="http://schemas.openxmlformats.org/drawingml/2006/main" xmlns:pic="http://schemas.openxmlformats.org/drawingml/2006/picture">
-            <wp:extent cx="2057400" cy="678488"/>
+            <wp:extent cx="5486400" cy="1809300"/>
             <wp:docPr id="4" name="Picture 4"/>
             <wp:cNvGraphicFramePr>
               <a:graphicFrameLocks noChangeAspect="1"/>
@@ -17224,7 +17245,7 @@
                   <pic:spPr>
                     <a:xfrm>
                       <a:off x="0" y="0"/>
-                      <a:ext cx="2057400" cy="678488"/>
+                      <a:ext cx="5486400" cy="1809300"/>
                     </a:xfrm>
                     <a:prstGeom prst="rect"/>
                   </pic:spPr>
@@ -19440,14 +19461,13 @@
     </w:p>
     <w:p>
       <w:pPr>
-        <w:keepNext/>
         <w:spacing w:before="0" w:after="0" w:line="240" w:lineRule="auto"/>
         <w:jc w:val="center"/>
       </w:pPr>
       <w:r>
         <w:drawing>
           <wp:inline xmlns:a="http://schemas.openxmlformats.org/drawingml/2006/main" xmlns:pic="http://schemas.openxmlformats.org/drawingml/2006/picture">
-            <wp:extent cx="2057400" cy="931230"/>
+            <wp:extent cx="5029200" cy="2276341"/>
             <wp:docPr id="5" name="Picture 5"/>
             <wp:cNvGraphicFramePr>
               <a:graphicFrameLocks noChangeAspect="1"/>
@@ -19468,7 +19488,7 @@
                   <pic:spPr>
                     <a:xfrm>
                       <a:off x="0" y="0"/>
-                      <a:ext cx="2057400" cy="931230"/>
+                      <a:ext cx="5029200" cy="2276341"/>
                     </a:xfrm>
                     <a:prstGeom prst="rect"/>
                   </pic:spPr>
@@ -19650,14 +19670,13 @@
     </w:p>
     <w:p>
       <w:pPr>
-        <w:keepNext/>
         <w:spacing w:before="0" w:after="0" w:line="240" w:lineRule="auto"/>
         <w:jc w:val="center"/>
       </w:pPr>
       <w:r>
         <w:drawing>
           <wp:inline xmlns:a="http://schemas.openxmlformats.org/drawingml/2006/main" xmlns:pic="http://schemas.openxmlformats.org/drawingml/2006/picture">
-            <wp:extent cx="2057400" cy="891716"/>
+            <wp:extent cx="5029200" cy="2179749"/>
             <wp:docPr id="6" name="Picture 6"/>
             <wp:cNvGraphicFramePr>
               <a:graphicFrameLocks noChangeAspect="1"/>
@@ -19678,7 +19697,7 @@
                   <pic:spPr>
                     <a:xfrm>
                       <a:off x="0" y="0"/>
-                      <a:ext cx="2057400" cy="891716"/>
+                      <a:ext cx="5029200" cy="2179749"/>
                     </a:xfrm>
                     <a:prstGeom prst="rect"/>
                   </pic:spPr>
@@ -19806,7 +19825,7 @@
           <w:color w:val="000000"/>
           <w:sz w:val="24"/>
         </w:rPr>
-        <w:t xml:space="preserve"> (Spearman). While a consistent spectral peak was observed between 2.2 and 2.5 Hz, this peak remained invariant across speeds from 0 to 120 km/h. Under the evaluated 10 Hz feature construction, no reliable speed dependence was identified in the dominant vibration frequency, with the ~2.2–2.5 Hz component being consistent with low-frequency vehicle-body/chassis dynamics rather than wheel rotation or engine harmonics.</w:t>
+        <w:t xml:space="preserve"> (Spearman). While a consistent spectral peak was observed between 2.2 and 2.5 Hz, this peak remained invariant across speeds from 0 to 120 km/h. Under the evaluated 10 Hz feature construction, no reliable speed dependence was identified in the dominant vibration frequency, with the ~2.2–2.5 Hz component being consistent with low-frequency vehicle-body/chassis dynamics; the physical mechanism was not directly identified.</w:t>
       </w:r>
     </w:p>
     <w:p>
@@ -19821,19 +19840,18 @@
           <w:color w:val="000000"/>
           <w:sz w:val="24"/>
         </w:rPr>
-        <w:t>Figure 7 shows the spectral energy distribution of vertical and horizontal acceleration across vehicle speed bands.</w:t>
+        <w:t>Figure 7 shows the acceleration power spectral density across vehicle speed bands and the cross-trip correlation between dominant frequency and vehicle speed.</w:t>
       </w:r>
     </w:p>
     <w:p>
       <w:pPr>
-        <w:keepNext/>
         <w:spacing w:before="0" w:after="0" w:line="240" w:lineRule="auto"/>
         <w:jc w:val="center"/>
       </w:pPr>
       <w:r>
         <w:drawing>
           <wp:inline xmlns:a="http://schemas.openxmlformats.org/drawingml/2006/main" xmlns:pic="http://schemas.openxmlformats.org/drawingml/2006/picture">
-            <wp:extent cx="2057400" cy="866745"/>
+            <wp:extent cx="5303520" cy="2234277"/>
             <wp:docPr id="7" name="Picture 7"/>
             <wp:cNvGraphicFramePr>
               <a:graphicFrameLocks noChangeAspect="1"/>
@@ -19854,7 +19872,7 @@
                   <pic:spPr>
                     <a:xfrm>
                       <a:off x="0" y="0"/>
-                      <a:ext cx="2057400" cy="866745"/>
+                      <a:ext cx="5303520" cy="2234277"/>
                     </a:xfrm>
                     <a:prstGeom prst="rect"/>
                   </pic:spPr>
@@ -19891,7 +19909,7 @@
           <w:color w:val="000000"/>
           <w:sz w:val="20"/>
         </w:rPr>
-        <w:t>), consistent with low-frequency vehicle-body/chassis dynamics. Panel (a) shows a motorway-specific spectral example with a peak near 2.9 Hz; the corpus-wide dominant-frequency census in panel (b) centres near 2.2–2.5 Hz across all 64 trips.</w:t>
+        <w:t>), consistent with low-frequency vehicle-body/chassis dynamics; the physical mechanism was not directly identified. Panel (a) shows a motorway-specific spectral example with a peak near 2.9 Hz; the corpus-wide dominant-frequency census in panel (b) centres near 2.2–2.5 Hz across all 64 trips.</w:t>
       </w:r>
     </w:p>
     <w:p>
@@ -19956,14 +19974,13 @@
     </w:p>
     <w:p>
       <w:pPr>
-        <w:keepNext/>
         <w:spacing w:before="0" w:after="0" w:line="240" w:lineRule="auto"/>
         <w:jc w:val="center"/>
       </w:pPr>
       <w:r>
         <w:drawing>
           <wp:inline xmlns:a="http://schemas.openxmlformats.org/drawingml/2006/main" xmlns:pic="http://schemas.openxmlformats.org/drawingml/2006/picture">
-            <wp:extent cx="2057400" cy="1646899"/>
+            <wp:extent cx="4937760" cy="3952558"/>
             <wp:docPr id="8" name="Picture 8"/>
             <wp:cNvGraphicFramePr>
               <a:graphicFrameLocks noChangeAspect="1"/>
@@ -19984,7 +20001,7 @@
                   <pic:spPr>
                     <a:xfrm>
                       <a:off x="0" y="0"/>
-                      <a:ext cx="2057400" cy="1646899"/>
+                      <a:ext cx="4937760" cy="3952558"/>
                     </a:xfrm>
                     <a:prstGeom prst="rect"/>
                   </pic:spPr>

</xml_diff>